<commit_message>
Identificació de les captures amb sudo hostname nom-cognom als dossiers de RA2-RA4
- A2.1 (Pas 0), A2.2 i A2.3: substitueix el títol del terminal per sudo hostname nom-cognom (canvi temporal, a repetir a cada sessió).
- A3.2, A3.3, A3.4, A4.2, A4.3 i A4.4: afegeix el mateix bloc d'identificació a l'enunciat.
- README actualitzat.

Co-Authored-By: Claude Opus 5.5 <noreply@anthropic.com>
Claude-Session: https://claude.ai/code/session_01BodJZ9PsepvknsFhsdyYkP
</commit_message>
<xml_diff>
--- a/RA2 - Emmagatzematge i copies de seguretat/AA1 - Protegint les dades/A2.1_Activitats_Protegint_les_dades.docx
+++ b/RA2 - Emmagatzematge i copies de seguretat/AA1 - Protegint les dades/A2.1_Activitats_Protegint_les_dades.docx
@@ -483,7 +483,7 @@
                 <w:szCs w:val="20"/>
                 <w:rtl w:val="0"/>
               </w:rPr>
-              <w:t xml:space="preserve">Aquesta activitat es cenyeix exclusivament a l'apartat NF2-AA1 (Protegint les dades) del RA2: continuïtat de negoci i recuperació de desastres, redundància, cicle de vida de les dades i destrucció segura de suports. Els exercicis requereixen recerca a Internet i, en un cas, l'anàlisi d'un vídeo. L'exercici 7 és una pràctica guiada a Ubuntu 26.04 (terminal), en què caldrà lliurar captures de pantalla amb el títol del terminal personalitzat. Respon de manera clara i justificada, citant les fonts que consultis.</w:t>
+              <w:t xml:space="preserve">Aquesta activitat es cenyeix exclusivament a l'apartat NF2-AA1 (Protegint les dades) del RA2: continuïtat de negoci i recuperació de desastres, redundància, cicle de vida de les dades i destrucció segura de suports. Els exercicis requereixen recerca a Internet i, en un cas, l'anàlisi d'un vídeo. L'exercici 7 és una pràctica guiada a Ubuntu 26.04 (terminal), en què caldrà lliurar captures de pantalla amb el nom d'equip personalitzat. Respon de manera clara i justificada, citant les fonts que consultis.</w:t>
             </w:r>
           </w:p>
         </w:tc>
@@ -1786,7 +1786,40 @@
                 <w:szCs w:val="20"/>
                 <w:rtl w:val="0"/>
               </w:rPr>
-              <w:t xml:space="preserve">Personalitza el títol del terminal perquè les captures siguin teves. Fes clic dret dins del terminal → «Estableix el títol». Al camp Títol, escriu les teves inicials i el teu nom i cognom, p. ex. JS - Nom Cognom, i tanca el pop-up. El títol apareixerà a la barra superior de la finestra (p. ex. «JS - Nom Cognom - alumne@equip: ~»). Totes les captures de la pràctica han de mostrar aquest títol. [CAPTURA]</w:t>
+              <w:t xml:space="preserve">Personalitza el nom de l'equip perquè les captures siguin teves: executa sudo hostname nom-cognom, amb el teu nom i primer cognom en minúscules, sense accents ni espais (p. ex. sudo hostname joan-sanchez), i després tanca el terminal i obre'n un de nou. El nom nou apareixerà a l'indicador i a la barra superior de la finestra (p. ex. usuario@joan-sanchez). El canvi és temporal: si la màquina virtual es tanca o es reinicia, es perd, i a la sessió següent cal tornar a executar l'ordre. Totes les captures de la pràctica han de mostrar aquest nom. [CAPTURA]</w:t>
+            </w:r>
+          </w:p>
+          <w:p>
+            <w:pPr>
+              <w:pBdr>
+                <w:top w:val="single" w:color="CADCE8" w:sz="4"/>
+                <w:bottom w:val="single" w:color="CADCE8" w:sz="4"/>
+                <w:left w:val="single" w:color="CADCE8" w:sz="4"/>
+                <w:right w:val="single" w:color="CADCE8" w:sz="4"/>
+              </w:pBdr>
+              <w:shd w:fill="F4F7F9" w:val="clear"/>
+              <w:spacing w:after="160" w:before="80"/>
+              <w:jc w:val="left"/>
+            </w:pPr>
+            <w:r>
+              <w:rPr>
+                <w:rFonts w:ascii="Consolas" w:cs="Consolas" w:eastAsia="Consolas" w:hAnsi="Consolas"/>
+                <w:sz w:val="19"/>
+                <w:szCs w:val="19"/>
+              </w:rPr>
+              <w:t xml:space="preserve">sudo hostname nom-cognom</w:t>
+            </w:r>
+            <w:r>
+              <w:br/>
+              <w:t xml:space="preserve"/>
+            </w:r>
+            <w:r>
+              <w:rPr>
+                <w:rFonts w:ascii="Consolas" w:cs="Consolas" w:eastAsia="Consolas" w:hAnsi="Consolas"/>
+                <w:sz w:val="19"/>
+                <w:szCs w:val="19"/>
+              </w:rPr>
+              <w:t xml:space="preserve"># Tanca el terminal i obre'n un de nou</w:t>
             </w:r>
           </w:p>
           <w:p>
@@ -1807,7 +1840,7 @@
               </w:rPr>
               <w:drawing>
                 <wp:inline distT="0" distB="0" distL="0" distR="0">
-                  <wp:extent cx="4382346" cy="2518319"/>
+                  <wp:extent cx="5120640" cy="490482"/>
                   <wp:effectExtent t="0" r="0" b="0" l="0"/>
                   <wp:docPr id="1" name="" descr="" title=""/>
                   <wp:cNvGraphicFramePr>
@@ -1823,7 +1856,7 @@
                           </pic:cNvPicPr>
                         </pic:nvPicPr>
                         <pic:blipFill>
-                          <a:blip r:embed="rId18" cstate="none"/>
+                          <a:blip r:embed="rId19" cstate="none"/>
                           <a:srcRect/>
                           <a:stretch>
                             <a:fillRect/>
@@ -1832,7 +1865,7 @@
                         <pic:spPr bwMode="auto">
                           <a:xfrm>
                             <a:off x="0" y="0"/>
-                            <a:ext cx="4382346" cy="2518319"/>
+                            <a:ext cx="5120640" cy="490482"/>
                           </a:xfrm>
                           <a:prstGeom prst="rect">
                             <a:avLst/>
@@ -1864,7 +1897,7 @@
                 <w:szCs w:val="20"/>
                 <w:rtl w:val="0"/>
               </w:rPr>
-              <w:t xml:space="preserve">Captura d'exemple: diàleg «Estableix el títol» del terminal d'Ubuntu (en aquesta captura, amb la interfície en castellà: «Establecer título»).</w:t>
+              <w:t xml:space="preserve">Captura d'exemple: terminal d'Ubuntu després d'executar sudo hostname joan-sanchez i obrir un terminal nou.</w:t>
             </w:r>
           </w:p>
           <w:p>

</xml_diff>

<commit_message>
RA2: les pràctiques ja no mostren les sortides de terminal a l'alumnat
- A2.1, A2.2 i A2.3: es treuen les captures de sortida i els seus peus; s'hi afegeixen preguntes d'observació.
- S'hi afegeixen les ordres que només apareixien dins de les captures (LVM pas 1-2, Duplicity pas 3-5).
- Duplicity: duplicity backup explícit i restauració a /tmp/restaurat (a Ubuntu 26.04 no restaura sobre una carpeta no buida).

Co-Authored-By: Claude Opus 5.5 <noreply@anthropic.com>
Claude-Session: https://claude.ai/code/session_01BodJZ9PsepvknsFhsdyYkP
</commit_message>
<xml_diff>
--- a/RA2 - Emmagatzematge i copies de seguretat/AA1 - Protegint les dades/A2.1_Activitats_Protegint_les_dades.docx
+++ b/RA2 - Emmagatzematge i copies de seguretat/AA1 - Protegint les dades/A2.1_Activitats_Protegint_les_dades.docx
@@ -2034,70 +2034,20 @@
             </w:pPr>
             <w:r>
               <w:rPr>
-                <w:sz w:val="20"/>
-                <w:szCs w:val="20"/>
-                <w:rtl w:val="0"/>
-              </w:rPr>
-              <w:drawing>
-                <wp:inline distT="0" distB="0" distL="0" distR="0">
-                  <wp:extent cx="5147733" cy="4443306"/>
-                  <wp:effectExtent t="0" r="0" b="0" l="0"/>
-                  <wp:docPr id="2" name="" descr="" title=""/>
-                  <wp:cNvGraphicFramePr>
-                    <a:graphicFrameLocks noChangeAspect="1"/>
-                  </wp:cNvGraphicFramePr>
-                  <a:graphic>
-                    <a:graphicData uri="http://schemas.openxmlformats.org/drawingml/2006/picture">
-                      <pic:pic>
-                        <pic:nvPicPr>
-                          <pic:cNvPr id="0" name="" descr=""/>
-                          <pic:cNvPicPr>
-                            <a:picLocks noChangeAspect="1" noChangeArrowheads="1"/>
-                          </pic:cNvPicPr>
-                        </pic:nvPicPr>
-                        <pic:blipFill>
-                          <a:blip r:embed="rId10" cstate="none"/>
-                          <a:srcRect/>
-                          <a:stretch>
-                            <a:fillRect/>
-                          </a:stretch>
-                        </pic:blipFill>
-                        <pic:spPr bwMode="auto">
-                          <a:xfrm>
-                            <a:off x="0" y="0"/>
-                            <a:ext cx="5147733" cy="4443306"/>
-                          </a:xfrm>
-                          <a:prstGeom prst="rect">
-                            <a:avLst/>
-                          </a:prstGeom>
-                        </pic:spPr>
-                      </pic:pic>
-                    </a:graphicData>
-                  </a:graphic>
-                </wp:inline>
-              </w:drawing>
-            </w:r>
-          </w:p>
-          <w:p>
-            <w:pPr>
-              <w:widowControl w:val="1"/>
-              <w:spacing w:line="240" w:lineRule="auto" w:after="100"/>
-              <w:rPr>
-                <w:color w:val="1155cc"/>
-                <w:sz w:val="20"/>
-                <w:szCs w:val="20"/>
-              </w:rPr>
-            </w:pPr>
-            <w:r>
-              <w:rPr>
-                <w:color w:val="5B6B77"/>
-                <w:iCs/>
-                <w:i/>
-                <w:sz w:val="20"/>
-                <w:szCs w:val="20"/>
-                <w:rtl w:val="0"/>
-              </w:rPr>
-              <w:t xml:space="preserve">Captura real: creació del disc de prova de 20 MB, format ext4 i muntatge a /mnt/prova.</w:t>
+                <w:b/>
+                <w:sz w:val="20"/>
+                <w:szCs w:val="20"/>
+                <w:rtl w:val="0"/>
+              </w:rPr>
+              <w:t xml:space="preserve">Observa: </w:t>
+            </w:r>
+            <w:r>
+              <w:rPr>
+                <w:sz w:val="20"/>
+                <w:szCs w:val="20"/>
+                <w:rtl w:val="0"/>
+              </w:rPr>
+              <w:t xml:space="preserve">quina mida té disc.img segons ls? Quin dispositiu /dev/loopN i quina mida mostra df per a /mnt/prova? Per què la mida que mostra df és més petita que els 20 MB del fitxer?</w:t>
             </w:r>
           </w:p>
           <w:p>
@@ -2198,70 +2148,20 @@
             </w:pPr>
             <w:r>
               <w:rPr>
-                <w:sz w:val="20"/>
-                <w:szCs w:val="20"/>
-                <w:rtl w:val="0"/>
-              </w:rPr>
-              <w:drawing>
-                <wp:inline distT="0" distB="0" distL="0" distR="0">
-                  <wp:extent cx="5669280" cy="2775447"/>
-                  <wp:effectExtent t="0" r="0" b="0" l="0"/>
-                  <wp:docPr id="3" name="" descr="" title=""/>
-                  <wp:cNvGraphicFramePr>
-                    <a:graphicFrameLocks noChangeAspect="1"/>
-                  </wp:cNvGraphicFramePr>
-                  <a:graphic>
-                    <a:graphicData uri="http://schemas.openxmlformats.org/drawingml/2006/picture">
-                      <pic:pic>
-                        <pic:nvPicPr>
-                          <pic:cNvPr id="0" name="" descr=""/>
-                          <pic:cNvPicPr>
-                            <a:picLocks noChangeAspect="1" noChangeArrowheads="1"/>
-                          </pic:cNvPicPr>
-                        </pic:nvPicPr>
-                        <pic:blipFill>
-                          <a:blip r:embed="rId11" cstate="none"/>
-                          <a:srcRect/>
-                          <a:stretch>
-                            <a:fillRect/>
-                          </a:stretch>
-                        </pic:blipFill>
-                        <pic:spPr bwMode="auto">
-                          <a:xfrm>
-                            <a:off x="0" y="0"/>
-                            <a:ext cx="5669280" cy="2775447"/>
-                          </a:xfrm>
-                          <a:prstGeom prst="rect">
-                            <a:avLst/>
-                          </a:prstGeom>
-                        </pic:spPr>
-                      </pic:pic>
-                    </a:graphicData>
-                  </a:graphic>
-                </wp:inline>
-              </w:drawing>
-            </w:r>
-          </w:p>
-          <w:p>
-            <w:pPr>
-              <w:widowControl w:val="1"/>
-              <w:spacing w:line="240" w:lineRule="auto" w:after="100"/>
-              <w:rPr>
-                <w:color w:val="1155cc"/>
-                <w:sz w:val="20"/>
-                <w:szCs w:val="20"/>
-              </w:rPr>
-            </w:pPr>
-            <w:r>
-              <w:rPr>
-                <w:color w:val="5B6B77"/>
-                <w:iCs/>
-                <w:i/>
-                <w:sz w:val="20"/>
-                <w:szCs w:val="20"/>
-                <w:rtl w:val="0"/>
-              </w:rPr>
-              <w:t xml:space="preserve">Captura real: el fitxer notes.txt es desa al disc i grep en troba el contingut dins de disc.img.</w:t>
+                <w:b/>
+                <w:sz w:val="20"/>
+                <w:szCs w:val="20"/>
+                <w:rtl w:val="0"/>
+              </w:rPr>
+              <w:t xml:space="preserve">Observa: </w:t>
+            </w:r>
+            <w:r>
+              <w:rPr>
+                <w:sz w:val="20"/>
+                <w:szCs w:val="20"/>
+                <w:rtl w:val="0"/>
+              </w:rPr>
+              <w:t xml:space="preserve">què mostra l'última ordre grep? Si el disc estava desmuntat, on ha trobat grep el text?</w:t>
             </w:r>
           </w:p>
           <w:p>
@@ -2374,70 +2274,20 @@
             </w:pPr>
             <w:r>
               <w:rPr>
-                <w:sz w:val="20"/>
-                <w:szCs w:val="20"/>
-                <w:rtl w:val="0"/>
-              </w:rPr>
-              <w:drawing>
-                <wp:inline distT="0" distB="0" distL="0" distR="0">
-                  <wp:extent cx="5425440" cy="2682240"/>
-                  <wp:effectExtent t="0" r="0" b="0" l="0"/>
-                  <wp:docPr id="4" name="" descr="" title=""/>
-                  <wp:cNvGraphicFramePr>
-                    <a:graphicFrameLocks noChangeAspect="1"/>
-                  </wp:cNvGraphicFramePr>
-                  <a:graphic>
-                    <a:graphicData uri="http://schemas.openxmlformats.org/drawingml/2006/picture">
-                      <pic:pic>
-                        <pic:nvPicPr>
-                          <pic:cNvPr id="0" name="" descr=""/>
-                          <pic:cNvPicPr>
-                            <a:picLocks noChangeAspect="1" noChangeArrowheads="1"/>
-                          </pic:cNvPicPr>
-                        </pic:nvPicPr>
-                        <pic:blipFill>
-                          <a:blip r:embed="rId12" cstate="none"/>
-                          <a:srcRect/>
-                          <a:stretch>
-                            <a:fillRect/>
-                          </a:stretch>
-                        </pic:blipFill>
-                        <pic:spPr bwMode="auto">
-                          <a:xfrm>
-                            <a:off x="0" y="0"/>
-                            <a:ext cx="5425440" cy="2682240"/>
-                          </a:xfrm>
-                          <a:prstGeom prst="rect">
-                            <a:avLst/>
-                          </a:prstGeom>
-                        </pic:spPr>
-                      </pic:pic>
-                    </a:graphicData>
-                  </a:graphic>
-                </wp:inline>
-              </w:drawing>
-            </w:r>
-          </w:p>
-          <w:p>
-            <w:pPr>
-              <w:widowControl w:val="1"/>
-              <w:spacing w:line="240" w:lineRule="auto" w:after="100"/>
-              <w:rPr>
-                <w:color w:val="1155cc"/>
-                <w:sz w:val="20"/>
-                <w:szCs w:val="20"/>
-              </w:rPr>
-            </w:pPr>
-            <w:r>
-              <w:rPr>
-                <w:color w:val="5B6B77"/>
-                <w:iCs/>
-                <w:i/>
-                <w:sz w:val="20"/>
-                <w:szCs w:val="20"/>
-                <w:rtl w:val="0"/>
-              </w:rPr>
-              <w:t xml:space="preserve">Captura real: després de rm, ls ja no mostra notes.txt, però grep continua trobant les dades de la Marta dins del disc.</w:t>
+                <w:b/>
+                <w:sz w:val="20"/>
+                <w:szCs w:val="20"/>
+                <w:rtl w:val="0"/>
+              </w:rPr>
+              <w:t xml:space="preserve">Observa: </w:t>
+            </w:r>
+            <w:r>
+              <w:rPr>
+                <w:sz w:val="20"/>
+                <w:szCs w:val="20"/>
+                <w:rtl w:val="0"/>
+              </w:rPr>
+              <w:t xml:space="preserve">què mostra ara ls -l /mnt/prova? I què mostra grep?</w:t>
             </w:r>
           </w:p>
           <w:p>
@@ -2545,70 +2395,20 @@
             </w:pPr>
             <w:r>
               <w:rPr>
-                <w:sz w:val="20"/>
-                <w:szCs w:val="20"/>
-                <w:rtl w:val="0"/>
-              </w:rPr>
-              <w:drawing>
-                <wp:inline distT="0" distB="0" distL="0" distR="0">
-                  <wp:extent cx="5560906" cy="2858346"/>
-                  <wp:effectExtent t="0" r="0" b="0" l="0"/>
-                  <wp:docPr id="5" name="" descr="" title=""/>
-                  <wp:cNvGraphicFramePr>
-                    <a:graphicFrameLocks noChangeAspect="1"/>
-                  </wp:cNvGraphicFramePr>
-                  <a:graphic>
-                    <a:graphicData uri="http://schemas.openxmlformats.org/drawingml/2006/picture">
-                      <pic:pic>
-                        <pic:nvPicPr>
-                          <pic:cNvPr id="0" name="" descr=""/>
-                          <pic:cNvPicPr>
-                            <a:picLocks noChangeAspect="1" noChangeArrowheads="1"/>
-                          </pic:cNvPicPr>
-                        </pic:nvPicPr>
-                        <pic:blipFill>
-                          <a:blip r:embed="rId13" cstate="none"/>
-                          <a:srcRect/>
-                          <a:stretch>
-                            <a:fillRect/>
-                          </a:stretch>
-                        </pic:blipFill>
-                        <pic:spPr bwMode="auto">
-                          <a:xfrm>
-                            <a:off x="0" y="0"/>
-                            <a:ext cx="5560906" cy="2858346"/>
-                          </a:xfrm>
-                          <a:prstGeom prst="rect">
-                            <a:avLst/>
-                          </a:prstGeom>
-                        </pic:spPr>
-                      </pic:pic>
-                    </a:graphicData>
-                  </a:graphic>
-                </wp:inline>
-              </w:drawing>
-            </w:r>
-          </w:p>
-          <w:p>
-            <w:pPr>
-              <w:widowControl w:val="1"/>
-              <w:spacing w:line="240" w:lineRule="auto" w:after="100"/>
-              <w:rPr>
-                <w:color w:val="1155cc"/>
-                <w:sz w:val="20"/>
-                <w:szCs w:val="20"/>
-              </w:rPr>
-            </w:pPr>
-            <w:r>
-              <w:rPr>
-                <w:color w:val="5B6B77"/>
-                <w:iCs/>
-                <w:i/>
-                <w:sz w:val="20"/>
-                <w:szCs w:val="20"/>
-                <w:rtl w:val="0"/>
-              </w:rPr>
-              <w:t xml:space="preserve">Captura real: shred fa 4 passades sobre el disc; grep ja no troba cap coincidència (0) i el disc ja no es pot muntar.</w:t>
+                <w:b/>
+                <w:sz w:val="20"/>
+                <w:szCs w:val="20"/>
+                <w:rtl w:val="0"/>
+              </w:rPr>
+              <w:t xml:space="preserve">Observa: </w:t>
+            </w:r>
+            <w:r>
+              <w:rPr>
+                <w:sz w:val="20"/>
+                <w:szCs w:val="20"/>
+                <w:rtl w:val="0"/>
+              </w:rPr>
+              <w:t xml:space="preserve">quantes passades fa shred? Quin número retorna grep -c? Què respon el sistema quan intentes muntar el disc?</w:t>
             </w:r>
           </w:p>
           <w:p>
@@ -2733,70 +2533,20 @@
             </w:pPr>
             <w:r>
               <w:rPr>
-                <w:sz w:val="20"/>
-                <w:szCs w:val="20"/>
-                <w:rtl w:val="0"/>
-              </w:rPr>
-              <w:drawing>
-                <wp:inline distT="0" distB="0" distL="0" distR="0">
-                  <wp:extent cx="5669280" cy="3972442"/>
-                  <wp:effectExtent t="0" r="0" b="0" l="0"/>
-                  <wp:docPr id="6" name="" descr="" title=""/>
-                  <wp:cNvGraphicFramePr>
-                    <a:graphicFrameLocks noChangeAspect="1"/>
-                  </wp:cNvGraphicFramePr>
-                  <a:graphic>
-                    <a:graphicData uri="http://schemas.openxmlformats.org/drawingml/2006/picture">
-                      <pic:pic>
-                        <pic:nvPicPr>
-                          <pic:cNvPr id="0" name="" descr=""/>
-                          <pic:cNvPicPr>
-                            <a:picLocks noChangeAspect="1" noChangeArrowheads="1"/>
-                          </pic:cNvPicPr>
-                        </pic:nvPicPr>
-                        <pic:blipFill>
-                          <a:blip r:embed="rId14" cstate="none"/>
-                          <a:srcRect/>
-                          <a:stretch>
-                            <a:fillRect/>
-                          </a:stretch>
-                        </pic:blipFill>
-                        <pic:spPr bwMode="auto">
-                          <a:xfrm>
-                            <a:off x="0" y="0"/>
-                            <a:ext cx="5669280" cy="3972442"/>
-                          </a:xfrm>
-                          <a:prstGeom prst="rect">
-                            <a:avLst/>
-                          </a:prstGeom>
-                        </pic:spPr>
-                      </pic:pic>
-                    </a:graphicData>
-                  </a:graphic>
-                </wp:inline>
-              </w:drawing>
-            </w:r>
-          </w:p>
-          <w:p>
-            <w:pPr>
-              <w:widowControl w:val="1"/>
-              <w:spacing w:line="240" w:lineRule="auto" w:after="100"/>
-              <w:rPr>
-                <w:color w:val="1155cc"/>
-                <w:sz w:val="20"/>
-                <w:szCs w:val="20"/>
-              </w:rPr>
-            </w:pPr>
-            <w:r>
-              <w:rPr>
-                <w:color w:val="5B6B77"/>
-                <w:iCs/>
-                <w:i/>
-                <w:sz w:val="20"/>
-                <w:szCs w:val="20"/>
-                <w:rtl w:val="0"/>
-              </w:rPr>
-              <w:t xml:space="preserve">Captura real: xifratge simètric amb GPG (AES-256), esborrat de l'original i desxifratge amb la contrasenya.</w:t>
+                <w:b/>
+                <w:sz w:val="20"/>
+                <w:szCs w:val="20"/>
+                <w:rtl w:val="0"/>
+              </w:rPr>
+              <w:t xml:space="preserve">Observa: </w:t>
+            </w:r>
+            <w:r>
+              <w:rPr>
+                <w:sz w:val="20"/>
+                <w:szCs w:val="20"/>
+                <w:rtl w:val="0"/>
+              </w:rPr>
+              <w:t xml:space="preserve">què indica l'ordre file sobre notes2.txt.gpg? Quin algorisme de xifratge s'ha fet servir?</w:t>
             </w:r>
           </w:p>
           <w:p>

</xml_diff>